<commit_message>
Replace paper schematic figures with real panels
</commit_message>
<xml_diff>
--- a/paper_codex_2page_rev154.docx
+++ b/paper_codex_2page_rev154.docx
@@ -783,14 +783,13 @@
         <w:spacing w:line="240" w:lineRule="auto" w:before="0" w:after="0"/>
         <w:jc w:val="left"/>
       </w:pPr>
+      <w:r/>
       <w:r>
         <w:rPr>
           <w:rFonts w:ascii="Times New Roman" w:hAnsi="Times New Roman" w:eastAsia="바탕체"/>
-          <w:b/>
-          <w:i w:val="0"/>
           <w:sz w:val="18"/>
         </w:rPr>
-        <w:t>Fig. 3. Representative patterns of Class A(a) and Class B(b), and a true Class A sample(c) misclassified as Class B by the first-stage CNN but corrected to Class A by the second-stage ROI-YOLO. The dashed yellow box indicates the ROI, and the green boxes denote YOLO detections of chip-level defect patterns within the ROI.</w:t>
+        <w:t>Fig. 3. ROI-YOLO based second-stage correction on a low-confidence wafer. The left panel shows the original wafer map, the middle panel shows the ROI and chip-level detections, and the right panel shows the detected chip failure pattern used for correction.</w:t>
       </w:r>
     </w:p>
     <w:p>
@@ -1583,14 +1582,13 @@
         <w:spacing w:line="240" w:lineRule="auto" w:before="0" w:after="0"/>
         <w:jc w:val="left"/>
       </w:pPr>
+      <w:r/>
       <w:r>
         <w:rPr>
           <w:rFonts w:ascii="Times New Roman" w:hAnsi="Times New Roman" w:eastAsia="바탕체"/>
-          <w:b/>
-          <w:i w:val="0"/>
           <w:sz w:val="18"/>
         </w:rPr>
-        <w:t>Fig. 4. Unknown-fail grouping on production images.</w:t>
+        <w:t>Fig. 4. Representative Unknown-fail candidate groups reviewed after contrastive embedding and HDBSCAN grouping.</w:t>
       </w:r>
     </w:p>
     <w:p>

</xml_diff>